<commit_message>
Completa entregables de diagramas finales
</commit_message>
<xml_diff>
--- a/documentacion/Especificacion_Final_Proyecto.docx
+++ b/documentacion/Especificacion_Final_Proyecto.docx
@@ -1109,7 +1109,7 @@
           <w:b w:val="0"/>
           <w:sz w:val="22"/>
         </w:rPr>
-        <w:t>Referencia documental: Diagrama_AS-IS.pdf, pendiente de anexar en la carpeta diagramas.</w:t>
+        <w:t>Referencia documental: diagramas/Diagrama_AS-IS.pdf incluido en la carpeta diagramas.</w:t>
       </w:r>
     </w:p>
     <w:p>
@@ -1151,7 +1151,7 @@
           <w:b w:val="0"/>
           <w:sz w:val="22"/>
         </w:rPr>
-        <w:t>Referencia documental: Diagrama_TO-BE.pdf, pendiente de anexar en la carpeta diagramas.</w:t>
+        <w:t>Referencia documental: diagramas/Diagrama_TO-BE.pdf incluido en la carpeta diagramas.</w:t>
       </w:r>
     </w:p>
     <w:p>
@@ -2399,7 +2399,7 @@
           <w:b w:val="0"/>
           <w:sz w:val="22"/>
         </w:rPr>
-        <w:t>Archivos relacionados: diagramas/Diagrama_ER.mwb y diagramas/Diagrama_ER.png. La imagen PNG del diagrama ER queda pendiente de exportar desde MySQL Workbench.</w:t>
+        <w:t>Archivos relacionados: diagramas/Diagrama_ER.mwb y diagramas/Diagrama_ER.png. Ambos archivos se incluyen en la carpeta diagramas.</w:t>
       </w:r>
     </w:p>
     <w:p>
@@ -3151,7 +3151,7 @@
           <w:rFonts w:ascii="Arial" w:hAnsi="Arial"/>
           <w:sz w:val="22"/>
         </w:rPr>
-        <w:t>diagramas/Diagrama_AS-IS.pdf (pendiente)</w:t>
+        <w:t>diagramas/Diagrama_AS-IS.pdf</w:t>
       </w:r>
     </w:p>
     <w:p>
@@ -3163,7 +3163,7 @@
           <w:rFonts w:ascii="Arial" w:hAnsi="Arial"/>
           <w:sz w:val="22"/>
         </w:rPr>
-        <w:t>diagramas/Diagrama_TO-BE.pdf (pendiente)</w:t>
+        <w:t>diagramas/Diagrama_TO-BE.pdf</w:t>
       </w:r>
     </w:p>
     <w:p>

</xml_diff>

<commit_message>
Actualiza documentos con firmas de validacion
</commit_message>
<xml_diff>
--- a/documentacion/Especificacion_Final_Proyecto.docx
+++ b/documentacion/Especificacion_Final_Proyecto.docx
@@ -362,7 +362,7 @@
           <w:b w:val="0"/>
           <w:sz w:val="22"/>
         </w:rPr>
-        <w:t>Este paquete documental integra la especificación final, la matriz de requerimientos, la matriz de trazabilidad, minutas de entrevista y validación, diagramas del proceso y modelo de datos. El prototipo fue revisado y aprobado académicamente por el profesor; la validación formal con la docente cliente queda pendiente de confirmación debido a que la maestra se encontraba en congreso al momento de preparar esta entrega.</w:t>
+        <w:t>Este paquete documental integra la especificación final, la matriz de requerimientos, la matriz de trazabilidad, minutas de entrevista y validación, diagramas del proceso y modelo de datos. El prototipo fue revisado y aprobado académicamente por el profesor; además, la validación formal con la docente cliente ya fue incorporada mediante la minuta firmada y evidencia de aprobación anexada.</w:t>
       </w:r>
     </w:p>
     <w:p>
@@ -1109,7 +1109,7 @@
           <w:b w:val="0"/>
           <w:sz w:val="22"/>
         </w:rPr>
-        <w:t>Referencia documental: diagramas/Diagrama_AS-IS.pdf incluido en la carpeta diagramas.</w:t>
+        <w:t>Referencia documental: Diagrama_AS-IS.pdf, pendiente de anexar en la carpeta diagramas.</w:t>
       </w:r>
     </w:p>
     <w:p>
@@ -1151,7 +1151,7 @@
           <w:b w:val="0"/>
           <w:sz w:val="22"/>
         </w:rPr>
-        <w:t>Referencia documental: diagramas/Diagrama_TO-BE.pdf incluido en la carpeta diagramas.</w:t>
+        <w:t>Referencia documental: Diagrama_TO-BE.pdf, pendiente de anexar en la carpeta diagramas.</w:t>
       </w:r>
     </w:p>
     <w:p>
@@ -2399,7 +2399,7 @@
           <w:b w:val="0"/>
           <w:sz w:val="22"/>
         </w:rPr>
-        <w:t>Archivos relacionados: diagramas/Diagrama_ER.mwb y diagramas/Diagrama_ER.png. Ambos archivos se incluyen en la carpeta diagramas.</w:t>
+        <w:t>Archivos relacionados: diagramas/Diagrama_ER.mwb y diagramas/Diagrama_ER.png. La imagen PNG del diagrama ER queda pendiente de exportar desde MySQL Workbench.</w:t>
       </w:r>
     </w:p>
     <w:p>
@@ -3025,7 +3025,7 @@
           <w:b w:val="0"/>
           <w:sz w:val="22"/>
         </w:rPr>
-        <w:t>El prototipo fue compartido para revisión. Al momento de preparar esta especificación, la docente cliente Mariely Acosta Álvarez aún no emitía retroalimentación formal debido a que se encontraba en un congreso. Sin embargo, el profesor Carlos Argelio Arevalo Mercado revisó y aprobó académicamente el avance de la aplicación.</w:t>
+        <w:t>El prototipo fue compartido para revisión con la docente cliente Mariely Acosta Álvarez y con el profesor Carlos Argelio Arevalo Mercado. La aprobación formal quedó documentada en la minuta de validación, que incluye firmas y evidencia de aceptación del prototipo funcional.</w:t>
       </w:r>
     </w:p>
     <w:p>
@@ -3035,7 +3035,7 @@
           <w:b w:val="0"/>
           <w:sz w:val="22"/>
         </w:rPr>
-        <w:t>La minuta de validación se encuentra en minutas/Minuta_Validacion_Prototipo.docx y debe completarse con la firma o evidencia de aprobación formal de la cliente en cuanto sea recibida.</w:t>
+        <w:t>La minuta de validación se encuentra en minutas/Minuta_Validacion_Prototipo.docx y ya incluye firma y evidencia de aprobación formal de la cliente.</w:t>
       </w:r>
     </w:p>
     <w:p>
@@ -3067,7 +3067,7 @@
           <w:b w:val="0"/>
           <w:sz w:val="22"/>
         </w:rPr>
-        <w:t>El proyecto queda preparado para continuar en etapas posteriores con refinamiento del modelo de datos, validación formal final con la cliente y posibles mejoras funcionales como exportación avanzada de reportes, rúbricas por competencia o mayor personalización del monitor clínico.</w:t>
+        <w:t>El proyecto queda preparado para continuar en etapas posteriores con refinamiento del modelo de datos y posibles mejoras funcionales como exportación avanzada de reportes, rúbricas por competencia o mayor personalización del monitor clínico; la validación formal final ya quedó documentada en la minuta firmada.</w:t>
       </w:r>
     </w:p>
     <w:p>
@@ -3151,7 +3151,7 @@
           <w:rFonts w:ascii="Arial" w:hAnsi="Arial"/>
           <w:sz w:val="22"/>
         </w:rPr>
-        <w:t>diagramas/Diagrama_AS-IS.pdf</w:t>
+        <w:t>diagramas/Diagrama_AS-IS.pdf (pendiente)</w:t>
       </w:r>
     </w:p>
     <w:p>
@@ -3163,7 +3163,7 @@
           <w:rFonts w:ascii="Arial" w:hAnsi="Arial"/>
           <w:sz w:val="22"/>
         </w:rPr>
-        <w:t>diagramas/Diagrama_TO-BE.pdf</w:t>
+        <w:t>diagramas/Diagrama_TO-BE.pdf (pendiente)</w:t>
       </w:r>
     </w:p>
     <w:p>

</xml_diff>

<commit_message>
Actualiza checklist final de entrega
</commit_message>
<xml_diff>
--- a/documentacion/Especificacion_Final_Proyecto.docx
+++ b/documentacion/Especificacion_Final_Proyecto.docx
@@ -1109,7 +1109,7 @@
           <w:b w:val="0"/>
           <w:sz w:val="22"/>
         </w:rPr>
-        <w:t>Referencia documental: Diagrama_AS-IS.pdf, pendiente de anexar en la carpeta diagramas.</w:t>
+        <w:t>Referencia documental: diagramas/Diagrama_AS-IS.pdf.</w:t>
       </w:r>
     </w:p>
     <w:p>
@@ -1151,7 +1151,7 @@
           <w:b w:val="0"/>
           <w:sz w:val="22"/>
         </w:rPr>
-        <w:t>Referencia documental: Diagrama_TO-BE.pdf, pendiente de anexar en la carpeta diagramas.</w:t>
+        <w:t>Referencia documental: diagramas/Diagrama_TO-BE.pdf.</w:t>
       </w:r>
     </w:p>
     <w:p>
@@ -2399,7 +2399,7 @@
           <w:b w:val="0"/>
           <w:sz w:val="22"/>
         </w:rPr>
-        <w:t>Archivos relacionados: diagramas/Diagrama_ER.mwb y diagramas/Diagrama_ER.png. La imagen PNG del diagrama ER queda pendiente de exportar desde MySQL Workbench.</w:t>
+        <w:t>Archivos relacionados: diagramas/Diagrama_ER.mwb y diagramas/Diagrama_ER.png.</w:t>
       </w:r>
     </w:p>
     <w:p>
@@ -3151,7 +3151,7 @@
           <w:rFonts w:ascii="Arial" w:hAnsi="Arial"/>
           <w:sz w:val="22"/>
         </w:rPr>
-        <w:t>diagramas/Diagrama_AS-IS.pdf (pendiente)</w:t>
+        <w:t>diagramas/Diagrama_AS-IS.pdf</w:t>
       </w:r>
     </w:p>
     <w:p>
@@ -3163,7 +3163,7 @@
           <w:rFonts w:ascii="Arial" w:hAnsi="Arial"/>
           <w:sz w:val="22"/>
         </w:rPr>
-        <w:t>diagramas/Diagrama_TO-BE.pdf (pendiente)</w:t>
+        <w:t>diagramas/Diagrama_TO-BE.pdf</w:t>
       </w:r>
     </w:p>
     <w:p>

</xml_diff>